<commit_message>
Fix cross-reference leaks and References duplication across AAC, FMS, IPC, MOM, PRE; correct ROM.6 stop-work tagging and disclaimer
</commit_message>
<xml_diff>
--- a/policies/build/rewrite_reference/HCO_AAC_10_v2_REWRITE_DRAFT.docx
+++ b/policies/build/rewrite_reference/HCO_AAC_10_v2_REWRITE_DRAFT.docx
@@ -1553,14 +1553,6 @@
     </w:p>
     <w:p>
       <w:pPr>
-        <w:pStyle w:val="ListNumber"/>
-      </w:pPr>
-      <w:r>
-        <w:t>Internal documents of «Hospital Name»: hand-over framework; internal referral guidance; transfer records; critical value alert log.</w:t>
-      </w:r>
-    </w:p>
-    <w:p>
-      <w:pPr>
         <w:pStyle w:val="Heading1"/>
       </w:pPr>
       <w:r>

</xml_diff>